<commit_message>
feat: mise a jour K1-MathInfo v3.2.0 (LatentGate, vCache, WRRF) et valorisation publications Dev.to
</commit_message>
<xml_diff>
--- a/KOA_MARIE_GERVAIS_NELLY_CV_EN.docx
+++ b/KOA_MARIE_GERVAIS_NELLY_CV_EN.docx
@@ -170,6 +170,19 @@
                 <w:sz w:val="16"/>
               </w:rPr>
               <w:t>🐙  github.com/gervais-afk</w:t>
+            </w:r>
+          </w:p>
+          <w:p>
+            <w:pPr>
+              <w:spacing w:before="0" w:after="50" w:line="259" w:lineRule="auto"/>
+              <w:ind w:left="100"/>
+            </w:pPr>
+            <w:r>
+              <w:rPr>
+                <w:color w:val="F8FAFC"/>
+                <w:sz w:val="16"/>
+              </w:rPr>
+              <w:t>✍  dev.to/gervais_marie</w:t>
             </w:r>
           </w:p>
           <w:p>
@@ -703,7 +716,7 @@
           </w:p>
           <w:p>
             <w:pPr>
-              <w:spacing w:before="44" w:after="2"/>
+              <w:spacing w:before="30" w:after="2"/>
             </w:pPr>
             <w:r>
               <w:rPr>
@@ -725,7 +738,7 @@
           </w:p>
           <w:p>
             <w:pPr>
-              <w:spacing w:before="0" w:after="20"/>
+              <w:spacing w:before="0" w:after="12"/>
             </w:pPr>
             <w:r>
               <w:rPr>
@@ -744,19 +757,19 @@
           </w:p>
           <w:p>
             <w:pPr>
-              <w:spacing w:before="8" w:after="20" w:line="252" w:lineRule="auto"/>
+              <w:spacing w:before="6" w:after="14" w:line="252" w:lineRule="auto"/>
             </w:pPr>
             <w:r>
               <w:rPr>
                 <w:color w:val="334155"/>
-                <w:sz w:val="17"/>
+                <w:sz w:val="16"/>
               </w:rPr>
               <w:t>Applied AI Engineer specializing in autonomous agent architectures, I design deterministic, explainable, and sovereign zero-hallucination systems. Member of the Google Developer Program, I bridge civil engineering rigor with advanced data science to solve complex operational challenges. Founder of Archi Cam AI (5D BIM SaaS &amp; predictive estimation), I build auditable, robust, and high-impact AI solutions.</w:t>
             </w:r>
           </w:p>
           <w:p>
             <w:pPr>
-              <w:spacing w:before="44" w:after="2"/>
+              <w:spacing w:before="30" w:after="2"/>
             </w:pPr>
             <w:r>
               <w:rPr>
@@ -778,7 +791,7 @@
           </w:p>
           <w:p>
             <w:pPr>
-              <w:spacing w:before="0" w:after="20"/>
+              <w:spacing w:before="0" w:after="12"/>
             </w:pPr>
             <w:r>
               <w:rPr>
@@ -797,7 +810,7 @@
           </w:p>
           <w:p>
             <w:pPr>
-              <w:spacing w:before="32" w:after="2"/>
+              <w:spacing w:before="24" w:after="2"/>
             </w:pPr>
             <w:r>
               <w:rPr>
@@ -818,7 +831,7 @@
           </w:p>
           <w:p>
             <w:pPr>
-              <w:spacing w:before="0" w:after="8" w:line="252" w:lineRule="auto"/>
+              <w:spacing w:before="0" w:after="5" w:line="252" w:lineRule="auto"/>
               <w:ind w:left="200"/>
             </w:pPr>
             <w:r>
@@ -839,7 +852,7 @@
           </w:p>
           <w:p>
             <w:pPr>
-              <w:spacing w:before="0" w:after="8" w:line="252" w:lineRule="auto"/>
+              <w:spacing w:before="0" w:after="5" w:line="252" w:lineRule="auto"/>
               <w:ind w:left="200"/>
             </w:pPr>
             <w:r>
@@ -860,7 +873,7 @@
           </w:p>
           <w:p>
             <w:pPr>
-              <w:spacing w:before="0" w:after="8" w:line="252" w:lineRule="auto"/>
+              <w:spacing w:before="0" w:after="5" w:line="252" w:lineRule="auto"/>
               <w:ind w:left="200"/>
             </w:pPr>
             <w:r>
@@ -881,7 +894,7 @@
           </w:p>
           <w:p>
             <w:pPr>
-              <w:spacing w:before="32" w:after="2"/>
+              <w:spacing w:before="24" w:after="2"/>
             </w:pPr>
             <w:r>
               <w:rPr>
@@ -897,12 +910,12 @@
                 <w:color w:val="0284C7"/>
                 <w:sz w:val="16"/>
               </w:rPr>
-              <w:t xml:space="preserve">   —   Sovereign Academic Research &amp; Asset Platform</w:t>
+              <w:t xml:space="preserve">   —   Sovereign Academic Research Platform</w:t>
             </w:r>
           </w:p>
           <w:p>
             <w:pPr>
-              <w:spacing w:before="0" w:after="8" w:line="252" w:lineRule="auto"/>
+              <w:spacing w:before="0" w:after="5" w:line="252" w:lineRule="auto"/>
               <w:ind w:left="200"/>
             </w:pPr>
             <w:r>
@@ -918,12 +931,12 @@
                 <w:color w:val="334155"/>
                 <w:sz w:val="16"/>
               </w:rPr>
-              <w:t>Preservation, indexing, and semantic exploration across 28 years of research (471 Ph.D. &amp; Master's docs, 4,494 relations).</w:t>
+              <w:t>GraphRAG over 30 yrs archives (471 theses DMI, 4,494 Neo4j relations), LatentGate (5.2ms) &amp; vCache (0% FP).</w:t>
             </w:r>
           </w:p>
           <w:p>
             <w:pPr>
-              <w:spacing w:before="0" w:after="8" w:line="252" w:lineRule="auto"/>
+              <w:spacing w:before="0" w:after="5" w:line="252" w:lineRule="auto"/>
               <w:ind w:left="200"/>
             </w:pPr>
             <w:r>
@@ -939,12 +952,12 @@
                 <w:color w:val="334155"/>
                 <w:sz w:val="16"/>
               </w:rPr>
-              <w:t>Neuro-symbolic Advisor Matcher, high availability with Circuit Breaker, and 192 automated unit/integration tests (100%).</w:t>
+              <w:t>Tri-engine WRRF (P@5=96.4%), S-GRPO, OKF v0.2 SHA-256 No-LLM, 192 tests (100%), and Dev.to deep-dive.</w:t>
             </w:r>
           </w:p>
           <w:p>
             <w:pPr>
-              <w:spacing w:before="32" w:after="2"/>
+              <w:spacing w:before="24" w:after="2"/>
             </w:pPr>
             <w:r>
               <w:rPr>
@@ -960,12 +973,12 @@
                 <w:color w:val="0284C7"/>
                 <w:sz w:val="16"/>
               </w:rPr>
-              <w:t xml:space="preserve">   —   Enterprise Business Intelligence &amp; Strategic Decision Engine</w:t>
+              <w:t xml:space="preserve">   —   Enterprise Business Intelligence &amp; Decisions</w:t>
             </w:r>
           </w:p>
           <w:p>
             <w:pPr>
-              <w:spacing w:before="0" w:after="8" w:line="252" w:lineRule="auto"/>
+              <w:spacing w:before="0" w:after="5" w:line="252" w:lineRule="auto"/>
               <w:ind w:left="200"/>
             </w:pPr>
             <w:r>
@@ -986,7 +999,7 @@
           </w:p>
           <w:p>
             <w:pPr>
-              <w:spacing w:before="0" w:after="8" w:line="252" w:lineRule="auto"/>
+              <w:spacing w:before="0" w:after="5" w:line="252" w:lineRule="auto"/>
               <w:ind w:left="200"/>
             </w:pPr>
             <w:r>
@@ -1007,7 +1020,7 @@
           </w:p>
           <w:p>
             <w:pPr>
-              <w:spacing w:before="32" w:after="2"/>
+              <w:spacing w:before="24" w:after="2"/>
             </w:pPr>
             <w:r>
               <w:rPr>
@@ -1023,12 +1036,12 @@
                 <w:color w:val="0284C7"/>
                 <w:sz w:val="16"/>
               </w:rPr>
-              <w:t xml:space="preserve">   —   Climate Resilience &amp; Production MLOps Systems</w:t>
+              <w:t xml:space="preserve">   —   Climate Resilience &amp; Production MLOps</w:t>
             </w:r>
           </w:p>
           <w:p>
             <w:pPr>
-              <w:spacing w:before="0" w:after="8" w:line="252" w:lineRule="auto"/>
+              <w:spacing w:before="0" w:after="5" w:line="252" w:lineRule="auto"/>
               <w:ind w:left="200"/>
             </w:pPr>
             <w:r>
@@ -1044,12 +1057,12 @@
                 <w:color w:val="334155"/>
                 <w:sz w:val="16"/>
               </w:rPr>
-              <w:t>Dataset Automator: Autonomous data engineering factory for reliable dataset preparation, fairness audits, and compliance.</w:t>
+              <w:t>Dataset Automator: MLOps data factory (TabFM, PAIR WIT, EU AI Act RSASSA-PSS seals) and Dev.to publication.</w:t>
             </w:r>
           </w:p>
           <w:p>
             <w:pPr>
-              <w:spacing w:before="0" w:after="8" w:line="252" w:lineRule="auto"/>
+              <w:spacing w:before="0" w:after="5" w:line="252" w:lineRule="auto"/>
               <w:ind w:left="200"/>
             </w:pPr>
             <w:r>
@@ -1070,7 +1083,7 @@
           </w:p>
           <w:p>
             <w:pPr>
-              <w:spacing w:before="44" w:after="2"/>
+              <w:spacing w:before="30" w:after="2"/>
             </w:pPr>
             <w:r>
               <w:rPr>
@@ -1092,7 +1105,7 @@
           </w:p>
           <w:p>
             <w:pPr>
-              <w:spacing w:before="0" w:after="20"/>
+              <w:spacing w:before="0" w:after="12"/>
             </w:pPr>
             <w:r>
               <w:rPr>
@@ -1111,7 +1124,7 @@
           </w:p>
           <w:p>
             <w:pPr>
-              <w:spacing w:before="32" w:after="2"/>
+              <w:spacing w:before="24" w:after="2"/>
             </w:pPr>
             <w:r>
               <w:rPr>
@@ -1145,7 +1158,7 @@
           </w:p>
           <w:p>
             <w:pPr>
-              <w:spacing w:before="0" w:after="8" w:line="252" w:lineRule="auto"/>
+              <w:spacing w:before="0" w:after="5" w:line="252" w:lineRule="auto"/>
               <w:ind w:left="200"/>
             </w:pPr>
             <w:r>
@@ -1166,7 +1179,7 @@
           </w:p>
           <w:p>
             <w:pPr>
-              <w:spacing w:before="0" w:after="8" w:line="252" w:lineRule="auto"/>
+              <w:spacing w:before="0" w:after="5" w:line="252" w:lineRule="auto"/>
               <w:ind w:left="200"/>
             </w:pPr>
             <w:r>
@@ -1187,7 +1200,7 @@
           </w:p>
           <w:p>
             <w:pPr>
-              <w:spacing w:before="32" w:after="2"/>
+              <w:spacing w:before="24" w:after="2"/>
             </w:pPr>
             <w:r>
               <w:rPr>
@@ -1221,7 +1234,7 @@
           </w:p>
           <w:p>
             <w:pPr>
-              <w:spacing w:before="0" w:after="8" w:line="252" w:lineRule="auto"/>
+              <w:spacing w:before="0" w:after="5" w:line="252" w:lineRule="auto"/>
               <w:ind w:left="200"/>
             </w:pPr>
             <w:r>
@@ -1242,7 +1255,7 @@
           </w:p>
           <w:p>
             <w:pPr>
-              <w:spacing w:before="0" w:after="8" w:line="252" w:lineRule="auto"/>
+              <w:spacing w:before="0" w:after="5" w:line="252" w:lineRule="auto"/>
               <w:ind w:left="200"/>
             </w:pPr>
             <w:r>
@@ -1263,7 +1276,7 @@
           </w:p>
           <w:p>
             <w:pPr>
-              <w:spacing w:before="44" w:after="2"/>
+              <w:spacing w:before="30" w:after="2"/>
             </w:pPr>
             <w:r>
               <w:rPr>
@@ -1285,7 +1298,7 @@
           </w:p>
           <w:p>
             <w:pPr>
-              <w:spacing w:before="0" w:after="20"/>
+              <w:spacing w:before="0" w:after="12"/>
             </w:pPr>
             <w:r>
               <w:rPr>
@@ -1304,7 +1317,7 @@
           </w:p>
           <w:p>
             <w:pPr>
-              <w:spacing w:before="32" w:after="2"/>
+              <w:spacing w:before="24" w:after="2"/>
             </w:pPr>
             <w:r>
               <w:rPr>
@@ -1338,7 +1351,7 @@
           </w:p>
           <w:p>
             <w:pPr>
-              <w:spacing w:before="0" w:after="8" w:line="252" w:lineRule="auto"/>
+              <w:spacing w:before="0" w:after="5" w:line="252" w:lineRule="auto"/>
               <w:ind w:left="200"/>
             </w:pPr>
             <w:r>
@@ -1359,7 +1372,7 @@
           </w:p>
           <w:p>
             <w:pPr>
-              <w:spacing w:before="0" w:after="8" w:line="252" w:lineRule="auto"/>
+              <w:spacing w:before="0" w:after="5" w:line="252" w:lineRule="auto"/>
               <w:ind w:left="200"/>
             </w:pPr>
             <w:r>
@@ -1380,7 +1393,7 @@
           </w:p>
           <w:p>
             <w:pPr>
-              <w:spacing w:before="32" w:after="2"/>
+              <w:spacing w:before="24" w:after="2"/>
             </w:pPr>
             <w:r>
               <w:rPr>
@@ -1414,7 +1427,7 @@
           </w:p>
           <w:p>
             <w:pPr>
-              <w:spacing w:before="0" w:after="8" w:line="252" w:lineRule="auto"/>
+              <w:spacing w:before="0" w:after="5" w:line="252" w:lineRule="auto"/>
               <w:ind w:left="200"/>
             </w:pPr>
             <w:r>
@@ -1435,7 +1448,7 @@
           </w:p>
           <w:p>
             <w:pPr>
-              <w:spacing w:before="44" w:after="2"/>
+              <w:spacing w:before="30" w:after="2"/>
             </w:pPr>
             <w:r>
               <w:rPr>
@@ -1457,7 +1470,7 @@
           </w:p>
           <w:p>
             <w:pPr>
-              <w:spacing w:before="0" w:after="20"/>
+              <w:spacing w:before="0" w:after="12"/>
             </w:pPr>
             <w:r>
               <w:rPr>
@@ -1476,7 +1489,7 @@
           </w:p>
           <w:p>
             <w:pPr>
-              <w:spacing w:before="24" w:after="8" w:line="252" w:lineRule="auto"/>
+              <w:spacing w:before="16" w:after="5" w:line="252" w:lineRule="auto"/>
               <w:ind w:left="200"/>
             </w:pPr>
             <w:r>
@@ -1507,7 +1520,38 @@
           </w:p>
           <w:p>
             <w:pPr>
-              <w:spacing w:before="24" w:after="8" w:line="252" w:lineRule="auto"/>
+              <w:spacing w:before="16" w:after="5" w:line="252" w:lineRule="auto"/>
+              <w:ind w:left="200"/>
+            </w:pPr>
+            <w:r>
+              <w:rPr>
+                <w:b/>
+                <w:color w:val="0284C7"/>
+                <w:sz w:val="15"/>
+              </w:rPr>
+              <w:t xml:space="preserve">◆  </w:t>
+            </w:r>
+            <w:r>
+              <w:rPr>
+                <w:rFonts w:ascii="Segoe UI" w:hAnsi="Segoe UI"/>
+                <w:b/>
+                <w:color w:val="0A1128"/>
+                <w:sz w:val="16"/>
+              </w:rPr>
+              <w:t xml:space="preserve">Technical Publications on DEV Community (2026)  —  </w:t>
+            </w:r>
+            <w:r>
+              <w:rPr>
+                <w:rFonts w:ascii="Segoe UI" w:hAnsi="Segoe UI"/>
+                <w:color w:val="334155"/>
+                <w:sz w:val="16"/>
+              </w:rPr>
+              <w:t>Author of architectural deep-dives: Zero-Hallucination GraphRAG &amp; Dataset Automator MLOps.</w:t>
+            </w:r>
+          </w:p>
+          <w:p>
+            <w:pPr>
+              <w:spacing w:before="16" w:after="5" w:line="252" w:lineRule="auto"/>
               <w:ind w:left="200"/>
             </w:pPr>
             <w:r>
@@ -1538,7 +1582,7 @@
           </w:p>
           <w:p>
             <w:pPr>
-              <w:spacing w:before="24" w:after="8" w:line="252" w:lineRule="auto"/>
+              <w:spacing w:before="16" w:after="5" w:line="252" w:lineRule="auto"/>
               <w:ind w:left="200"/>
             </w:pPr>
             <w:r>

</xml_diff>

<commit_message>
feat: moderniser executive summary en Architecte Systemes IA & Data et synchroniser CVs
</commit_message>
<xml_diff>
--- a/KOA_MARIE_GERVAIS_NELLY_CV_EN.docx
+++ b/KOA_MARIE_GERVAIS_NELLY_CV_EN.docx
@@ -699,7 +699,7 @@
                 <w:color w:val="0284C7"/>
                 <w:sz w:val="18"/>
               </w:rPr>
-              <w:t>Lead AI Engineer &amp; Data Architect   │   Founder @ Archi Cam AI</w:t>
+              <w:t>AI Systems Architect &amp; Data Engineer   │   Founder @ Archi Cam AI</w:t>
             </w:r>
           </w:p>
           <w:p>
@@ -764,7 +764,7 @@
                 <w:color w:val="334155"/>
                 <w:sz w:val="16"/>
               </w:rPr>
-              <w:t>Applied AI Engineer specializing in autonomous agent architectures, I design deterministic, explainable, and sovereign zero-hallucination systems. Member of the Google Developer Program, I bridge civil engineering rigor with advanced data science to solve complex operational challenges. Founder of Archi Cam AI (5D BIM SaaS &amp; predictive estimation), I build auditable, robust, and high-impact AI solutions.</w:t>
+              <w:t>AI Systems Architect &amp; Data Engineer designing and deploying mission-critical autonomous multi-agent architectures, Neo4j GraphRAG, and sovereign production MLOps pipelines. Specialized in deterministic zero-hallucination systems, neuro-symbolic reasoning, and verifiable algorithmic trust. Founder of Archi Cam AI (5D BIM), bridging structural engineering rigor with modern systems engineering for high-impact enterprise solutions.</w:t>
             </w:r>
           </w:p>
           <w:p>
@@ -1600,7 +1600,7 @@
                 <w:color w:val="0A1128"/>
                 <w:sz w:val="16"/>
               </w:rPr>
-              <w:t xml:space="preserve">Google Developer Program · AICC Accra  —  </w:t>
+              <w:t xml:space="preserve">AICC Accra &amp; Startup Ecosystem  —  </w:t>
             </w:r>
             <w:r>
               <w:rPr>

</xml_diff>